<commit_message>
feat(games): implement developer home, new game registration, and game page features
- Add DevHome component for developers to view their games and earnings.
- Create DevNewGame component for registering new games with a form.
- Implement GamePage component to display game details, play options, and leaderboard.
- Develop GamesHome component as the landing page for Deck Games with various sections.
- Add PurchaseComplete component to handle post-purchase confirmation and messaging.
- Introduce new CSS styles for the games section to enhance visual design and user experience.
</commit_message>
<xml_diff>
--- a/public/Deck-Handbook.docx
+++ b/public/Deck-Handbook.docx
@@ -157,7 +157,7 @@
                 <w:sz w:val="20"/>
                 <w:szCs w:val="20"/>
               </w:rPr>
-              <w:t xml:space="preserve">Paystack, collected centrally and disbursed by Deck</w:t>
+              <w:t xml:space="preserve">Bachs: collected centrally, transferred to sellers' sub-accounts after a 14-day hold</w:t>
             </w:r>
           </w:p>
         </w:tc>
@@ -311,7 +311,7 @@
           <w:sz w:val="17"/>
           <w:szCs w:val="17"/>
         </w:rPr>
-        <w:t xml:space="preserve">Generated 2026-09-15</w:t>
+        <w:t xml:space="preserve">Generated 2026-10-15</w:t>
       </w:r>
     </w:p>
     <w:p>
@@ -3286,7 +3286,20 @@
           <w:sz w:val="21"/>
           <w:szCs w:val="21"/>
         </w:rPr>
-        <w:t xml:space="preserve">Every charge lands in Deck's Paystack account. Deck then owes sellers, which makes the arithmetic more important rather than less, because nothing external will catch a discrepancy.</w:t>
+        <w:t xml:space="preserve">Every charge lands in Deck's Bachs account. Deck then owes sellers, which makes the arithmetic more important rather than less, because nothing external will catch a discrepancy. What is owed is never stored: it is derived each time from paid orders and contributions, minus transfers already sent.</w:t>
+      </w:r>
+    </w:p>
+    <w:p>
+      <w:pPr>
+        <w:spacing w:after="160" w:line="300"/>
+      </w:pPr>
+      <w:r>
+        <w:rPr>
+          <w:color w:val="111111"/>
+          <w:sz w:val="21"/>
+          <w:szCs w:val="21"/>
+        </w:rPr>
+        <w:t xml:space="preserve">Sellers are paid by transfer to their own Bachs sub-account. Each sale is held for PAYOUT_HOLD_DAYS (14) to cover refunds, then an hourly in-process run sends whatever has cleared. A pending payout row is written before Bachs is called and its id is the idempotency key, so a crash mid-run cannot pay twice.</w:t>
       </w:r>
     </w:p>
     <w:p>
@@ -3423,7 +3436,53 @@
                 <w:sz w:val="20"/>
                 <w:szCs w:val="20"/>
               </w:rPr>
-              <w:t xml:space="preserve">Same fee machinery. Nothing counts until Paystack confirms the charge.</w:t>
+              <w:t xml:space="preserve">Same fee machinery. Nothing counts until Bachs confirms the charge.</w:t>
+            </w:r>
+          </w:p>
+        </w:tc>
+      </w:tr>
+      <w:tr>
+        <w:tc>
+          <w:tcPr>
+            <w:tcW w:type="dxa" w:w="2600"/>
+            <w:tcMar>
+              <w:top w:type="dxa" w:w="90"/>
+              <w:left w:type="dxa" w:w="0"/>
+              <w:bottom w:type="dxa" w:w="90"/>
+              <w:right w:type="dxa" w:w="140"/>
+            </w:tcMar>
+          </w:tcPr>
+          <w:p>
+            <w:r>
+              <w:rPr>
+                <w:b/>
+                <w:bCs/>
+                <w:color w:val="111111"/>
+                <w:sz w:val="17"/>
+                <w:szCs w:val="17"/>
+              </w:rPr>
+              <w:t xml:space="preserve">GAMES</w:t>
+            </w:r>
+          </w:p>
+        </w:tc>
+        <w:tc>
+          <w:tcPr>
+            <w:tcW w:type="dxa" w:w="6600"/>
+            <w:tcMar>
+              <w:top w:type="dxa" w:w="90"/>
+              <w:left w:type="dxa" w:w="0"/>
+              <w:bottom w:type="dxa" w:w="90"/>
+              <w:right w:type="dxa" w:w="0"/>
+            </w:tcMar>
+          </w:tcPr>
+          <w:p>
+            <w:r>
+              <w:rPr>
+                <w:color w:val="55534E"/>
+                <w:sz w:val="20"/>
+                <w:szCs w:val="20"/>
+              </w:rPr>
+              <w:t xml:space="preserve">Deck Games: in-game purchases split 80/20 (GAME_FEE_PERCENT), frozen at the sale, test purchases never earn. Paid through the same hold and transfer run.</w:t>
             </w:r>
           </w:p>
         </w:tc>
@@ -4577,7 +4636,7 @@
                 <w:sz w:val="20"/>
                 <w:szCs w:val="20"/>
               </w:rPr>
-              <w:t xml:space="preserve">MONGODB_URI, JWT_SECRET, PAYSTACK_SECRET_KEY, CURRENCY. Optional: IMAGE_API_KEY for lifestyle renders, ACQUISITION_FEE_PERCENT, EDIT_WINDOW_HOURS.</w:t>
+              <w:t xml:space="preserve">MONGODB_URI, JWT_SECRET, BACHS_SECRET_KEY, BACHS_WEBHOOK_SECRET, PAYMENT_RETURN_URL, CURRENCY. Optional: IMAGE_API_KEY for lifestyle renders, ACQUISITION_FEE_PERCENT, EDIT_WINDOW_HOURS.</w:t>
             </w:r>
           </w:p>
         </w:tc>

</xml_diff>